<commit_message>
End of HTTML/CSS Lessons
</commit_message>
<xml_diff>
--- a/Claude outputs/course_book-6.docx
+++ b/Claude outputs/course_book-6.docx
@@ -419,11 +419,11 @@
           <w:rFonts w:ascii="Calibri" w:cs="Calibri" w:eastAsia="Calibri" w:hAnsi="Calibri"/>
           <w:i/>
           <w:iCs/>
-          <w:color w:val="999999"/>
-          <w:sz w:val="20"/>
-          <w:szCs w:val="20"/>
-        </w:rPr>
-        <w:t xml:space="preserve">  [in progress]</w:t>
+          <w:color w:val="3C9A5F"/>
+          <w:sz w:val="20"/>
+          <w:szCs w:val="20"/>
+        </w:rPr>
+        <w:t xml:space="preserve">  [done]</w:t>
       </w:r>
     </w:p>
     <w:p>
@@ -945,7 +945,7 @@
           <w:sz w:val="24"/>
           <w:szCs w:val="24"/>
         </w:rPr>
-        <w:t xml:space="preserve">Overall: 18%  (11 of 62 estimated lessons completed)</w:t>
+        <w:t xml:space="preserve">Overall: 19%  (12 of 62 estimated lessons completed)</w:t>
       </w:r>
     </w:p>
     <w:tbl>
@@ -961,13 +961,13 @@
         </w:tblBorders>
       </w:tblPr>
       <w:tblGrid>
-        <w:gridCol w:w="1620"/>
-        <w:gridCol w:w="7380"/>
+        <w:gridCol w:w="1710"/>
+        <w:gridCol w:w="7290"/>
       </w:tblGrid>
       <w:tr>
         <w:tc>
           <w:tcPr>
-            <w:tcW w:type="dxa" w:w="1620"/>
+            <w:tcW w:type="dxa" w:w="1710"/>
             <w:shd w:fill="4A76C7" w:val="clear"/>
             <w:tcMar>
               <w:top w:type="dxa" w:w="60"/>
@@ -980,7 +980,7 @@
         </w:tc>
         <w:tc>
           <w:tcPr>
-            <w:tcW w:type="dxa" w:w="7380"/>
+            <w:tcW w:type="dxa" w:w="7290"/>
             <w:shd w:fill="E5E5E5" w:val="clear"/>
             <w:tcMar>
               <w:top w:type="dxa" w:w="60"/>
@@ -1096,7 +1096,7 @@
           <w:sz w:val="22"/>
           <w:szCs w:val="22"/>
         </w:rPr>
-        <w:t xml:space="preserve">Phase 3 — HTML &amp; CSS Fundamentals — 0% (0/5)</w:t>
+        <w:t xml:space="preserve">Phase 3 — HTML &amp; CSS Fundamentals — 20% (1/5)</w:t>
       </w:r>
     </w:p>
     <w:tbl>
@@ -1112,12 +1112,26 @@
         </w:tblBorders>
       </w:tblPr>
       <w:tblGrid>
-        <w:gridCol w:w="9000"/>
+        <w:gridCol w:w="1800"/>
+        <w:gridCol w:w="7200"/>
       </w:tblGrid>
       <w:tr>
         <w:tc>
           <w:tcPr>
-            <w:tcW w:type="dxa" w:w="9000"/>
+            <w:tcW w:type="dxa" w:w="1800"/>
+            <w:shd w:fill="7BA7E1" w:val="clear"/>
+            <w:tcMar>
+              <w:top w:type="dxa" w:w="60"/>
+              <w:left w:type="dxa" w:w="0"/>
+              <w:bottom w:type="dxa" w:w="60"/>
+              <w:right w:type="dxa" w:w="0"/>
+            </w:tcMar>
+          </w:tcPr>
+          <w:p/>
+        </w:tc>
+        <w:tc>
+          <w:tcPr>
+            <w:tcW w:type="dxa" w:w="7200"/>
             <w:shd w:fill="E5E5E5" w:val="clear"/>
             <w:tcMar>
               <w:top w:type="dxa" w:w="60"/>

</xml_diff>